<commit_message>
Update JavaFX UI and final OO submission package
</commit_message>
<xml_diff>
--- a/docs/面向对象程序与设计/我们的实际写作/面向对象程序设计实践附加说明.docx
+++ b/docs/面向对象程序与设计/我们的实际写作/面向对象程序设计实践附加说明.docx
@@ -803,7 +803,7 @@
                 <w:b w:val="0"/>
                 <w:sz w:val="21"/>
               </w:rPr>
-              <w:t>mvn -DskipTests package</w:t>
+              <w:t>mvn -q -DskipTests compile</w:t>
             </w:r>
           </w:p>
         </w:tc>
@@ -837,7 +837,7 @@
                 <w:b w:val="0"/>
                 <w:sz w:val="21"/>
               </w:rPr>
-              <w:t>生成 target/image-manager-1.0.0.jar。</w:t>
+              <w:t>确认当前 JavaFX、FXML、CSS 和控制器代码能完成编译。</w:t>
             </w:r>
           </w:p>
         </w:tc>
@@ -859,7 +859,7 @@
                 <w:b w:val="0"/>
                 <w:sz w:val="21"/>
               </w:rPr>
-              <w:t>静态残留扫描</w:t>
+              <w:t>mvn -q test</w:t>
             </w:r>
           </w:p>
         </w:tc>
@@ -893,7 +893,119 @@
                 <w:b w:val="0"/>
                 <w:sz w:val="21"/>
               </w:rPr>
-              <w:t>源码中不再保留旧默认模型、旧批处理高上限或 enable-preview 启动要求。</w:t>
+              <w:t>执行现有测试，确认本次界面风格改造没有破坏构建。</w:t>
+            </w:r>
+          </w:p>
+        </w:tc>
+      </w:tr>
+      <w:tr>
+        <w:tc>
+          <w:tcPr>
+            <w:tcW w:type="dxa" w:w="3969"/>
+            <w:vAlign w:val="center"/>
+          </w:tcPr>
+          <w:p>
+            <w:pPr>
+              <w:jc w:val="center"/>
+            </w:pPr>
+            <w:r/>
+            <w:r>
+              <w:rPr>
+                <w:rFonts w:ascii="宋体" w:hAnsi="宋体" w:eastAsia="宋体"/>
+                <w:b w:val="0"/>
+                <w:sz w:val="21"/>
+              </w:rPr>
+              <w:t>UiSnapshotSmoke</w:t>
+            </w:r>
+          </w:p>
+        </w:tc>
+        <w:tc>
+          <w:tcPr>
+            <w:tcW w:type="dxa" w:w="1134"/>
+            <w:vAlign w:val="center"/>
+          </w:tcPr>
+          <w:p>
+            <w:r/>
+            <w:r>
+              <w:rPr>
+                <w:rFonts w:ascii="宋体" w:hAnsi="宋体" w:eastAsia="宋体"/>
+                <w:b w:val="0"/>
+                <w:sz w:val="21"/>
+              </w:rPr>
+              <w:t>通过</w:t>
+            </w:r>
+          </w:p>
+        </w:tc>
+        <w:tc>
+          <w:tcPr>
+            <w:tcW w:type="dxa" w:w="3685"/>
+            <w:vAlign w:val="center"/>
+          </w:tcPr>
+          <w:p>
+            <w:r/>
+            <w:r>
+              <w:rPr>
+                <w:rFonts w:ascii="宋体" w:hAnsi="宋体" w:eastAsia="宋体"/>
+                <w:b w:val="0"/>
+                <w:sz w:val="21"/>
+              </w:rPr>
+              <w:t>直接加载当前 FXML 与 style.css，生成全部主要界面的多尺寸真实截图。</w:t>
+            </w:r>
+          </w:p>
+        </w:tc>
+      </w:tr>
+      <w:tr>
+        <w:tc>
+          <w:tcPr>
+            <w:tcW w:type="dxa" w:w="3969"/>
+            <w:vAlign w:val="center"/>
+          </w:tcPr>
+          <w:p>
+            <w:pPr>
+              <w:jc w:val="center"/>
+            </w:pPr>
+            <w:r/>
+            <w:r>
+              <w:rPr>
+                <w:rFonts w:ascii="宋体" w:hAnsi="宋体" w:eastAsia="宋体"/>
+                <w:b w:val="0"/>
+                <w:sz w:val="21"/>
+              </w:rPr>
+              <w:t>FXML/CSS 静态检查</w:t>
+            </w:r>
+          </w:p>
+        </w:tc>
+        <w:tc>
+          <w:tcPr>
+            <w:tcW w:type="dxa" w:w="1134"/>
+            <w:vAlign w:val="center"/>
+          </w:tcPr>
+          <w:p>
+            <w:r/>
+            <w:r>
+              <w:rPr>
+                <w:rFonts w:ascii="宋体" w:hAnsi="宋体" w:eastAsia="宋体"/>
+                <w:b w:val="0"/>
+                <w:sz w:val="21"/>
+              </w:rPr>
+              <w:t>通过</w:t>
+            </w:r>
+          </w:p>
+        </w:tc>
+        <w:tc>
+          <w:tcPr>
+            <w:tcW w:type="dxa" w:w="3685"/>
+            <w:vAlign w:val="center"/>
+          </w:tcPr>
+          <w:p>
+            <w:r/>
+            <w:r>
+              <w:rPr>
+                <w:rFonts w:ascii="宋体" w:hAnsi="宋体" w:eastAsia="宋体"/>
+                <w:b w:val="0"/>
+                <w:sz w:val="21"/>
+              </w:rPr>
+              <w:t>FXML 可解析，新增 styleClass 均有 CSS 定义，未保留关键内联颜色样式。</w:t>
             </w:r>
           </w:p>
         </w:tc>

</xml_diff>